<commit_message>
Remediate Wave-1 package: remove Confidential/KILL branding, EXP-002-first asks, honest public-code scope.
Co-authored-by: Cursor <cursoragent@cursor.com>
</commit_message>
<xml_diff>
--- a/Structural_Identifiability_Epistemic_Value_Active_Inference_v1.1.docx
+++ b/Structural_Identifiability_Epistemic_Value_Active_Inference_v1.1.docx
@@ -84,7 +84,7 @@
           <w:color w:val="555555"/>
           <w:sz w:val="20"/>
         </w:rPr>
-        <w:t>Internal project identifier: AIF-KILL-001</w:t>
+        <w:t>Public title: Structural Identifiability of Epistemic Value · matched-channel design</w:t>
       </w:r>
     </w:p>
     <w:p>
@@ -8984,7 +8984,7 @@
                 <w:color w:val="222222"/>
                 <w:sz w:val="18"/>
               </w:rPr>
-              <w:t>v1 search grid (from aif_kill_test.py)</w:t>
+              <w:t>v1 search grid (from reduced_aif_v1.py)</w:t>
             </w:r>
           </w:p>
         </w:tc>
@@ -9378,7 +9378,43 @@
           <w:color w:val="222222"/>
           <w:sz w:val="22"/>
         </w:rPr>
-        <w:t>aif_kill_test.py</w:t>
+        <w:t>reduced_aif_v1.py</w:t>
+      </w:r>
+    </w:p>
+    <w:p>
+      <w:pPr>
+        <w:pStyle w:val="ListBullet"/>
+        <w:spacing w:after="60"/>
+        <w:ind w:left="504"/>
+        <w:jc w:val="left"/>
+      </w:pPr>
+      <w:r>
+        <w:rPr>
+          <w:rFonts w:ascii="Times New Roman" w:hAnsi="Times New Roman" w:eastAsia="Times New Roman"/>
+          <w:b w:val="0"/>
+          <w:i w:val="0"/>
+          <w:color w:val="222222"/>
+          <w:sz w:val="22"/>
+        </w:rPr>
+        <w:t>reduced_aif_v1_top_conditions.csv</w:t>
+      </w:r>
+    </w:p>
+    <w:p>
+      <w:pPr>
+        <w:pStyle w:val="ListBullet"/>
+        <w:spacing w:after="60"/>
+        <w:ind w:left="504"/>
+        <w:jc w:val="left"/>
+      </w:pPr>
+      <w:r>
+        <w:rPr>
+          <w:rFonts w:ascii="Times New Roman" w:hAnsi="Times New Roman" w:eastAsia="Times New Roman"/>
+          <w:b w:val="0"/>
+          <w:i w:val="0"/>
+          <w:color w:val="222222"/>
+          <w:sz w:val="22"/>
+        </w:rPr>
+        <w:t>nelson2010.py</w:t>
       </w:r>
     </w:p>
     <w:p>
@@ -9583,7 +9619,7 @@
           <w:color w:val="222222"/>
           <w:sz w:val="22"/>
         </w:rPr>
-        <w:t>Removed AIF-KILL from the public-facing title; retained it only as an internal project identifier.</w:t>
+        <w:t>Removed AIF-KILL branding from public-facing titles and PDF headers; public name is Epistemic ID / matched-channel design.</w:t>
       </w:r>
     </w:p>
     <w:p>
@@ -10170,7 +10206,7 @@
         <w:color w:val="555555"/>
         <w:sz w:val="16"/>
       </w:rPr>
-      <w:t xml:space="preserve">    |    Internal ID: AIF-KILL-001</w:t>
+      <w:t xml:space="preserve">    |    Epistemic ID</w:t>
     </w:r>
   </w:p>
 </w:ftr>

</xml_diff>

<commit_message>
Add the asymmetric-channel ambiguity gate and mark unpublished v3-v8 files as absent.
Co-authored-by: Cursor <cursoragent@cursor.com>
</commit_message>
<xml_diff>
--- a/Structural_Identifiability_Epistemic_Value_Active_Inference_v1.1.docx
+++ b/Structural_Identifiability_Epistemic_Value_Active_Inference_v1.1.docx
@@ -9365,10 +9365,9 @@
     </w:p>
     <w:p>
       <w:pPr>
-        <w:pStyle w:val="ListBullet"/>
-        <w:spacing w:after="60"/>
-        <w:ind w:left="504"/>
-        <w:jc w:val="left"/>
+        <w:spacing w:after="160" w:before="0" w:line="276" w:lineRule="auto"/>
+        <w:ind w:firstLine="0"/>
+        <w:jc w:val="both"/>
       </w:pPr>
       <w:r>
         <w:rPr>
@@ -9378,7 +9377,7 @@
           <w:color w:val="222222"/>
           <w:sz w:val="22"/>
         </w:rPr>
-        <w:t>reduced_aif_v1.py</w:t>
+        <w:t>Publicly shipped and reproducible in this repository:</w:t>
       </w:r>
     </w:p>
     <w:p>
@@ -9396,7 +9395,7 @@
           <w:color w:val="222222"/>
           <w:sz w:val="22"/>
         </w:rPr>
-        <w:t>reduced_aif_v1_top_conditions.csv</w:t>
+        <w:t>artifacts/reduced_aif_v1.py — v1 symmetric-cue reduced controller and grid</w:t>
       </w:r>
     </w:p>
     <w:p>
@@ -9414,7 +9413,7 @@
           <w:color w:val="222222"/>
           <w:sz w:val="22"/>
         </w:rPr>
-        <w:t>nelson2010.py</w:t>
+        <w:t>artifacts/reduced_aif_v1_top_conditions.csv — v1 grid output used by scripts/reproduce.py</w:t>
       </w:r>
     </w:p>
     <w:p>
@@ -9432,7 +9431,7 @@
           <w:color w:val="222222"/>
           <w:sz w:val="22"/>
         </w:rPr>
-        <w:t>v3_alpha_recovery.csv</w:t>
+        <w:t>artifacts/nelson2010.py and tests/test_nelson2010.py — independent Nelson 2010 E3C1 recalculation</w:t>
       </w:r>
     </w:p>
     <w:p>
@@ -9450,7 +9449,7 @@
           <w:color w:val="222222"/>
           <w:sz w:val="22"/>
         </w:rPr>
-        <w:t>v4_equivalence_stats.csv</w:t>
+        <w:t>scripts/reproduce.py — one-command check of the shipped v1 and Nelson invariants</w:t>
       </w:r>
     </w:p>
     <w:p>
@@ -9468,15 +9467,14 @@
           <w:color w:val="222222"/>
           <w:sz w:val="22"/>
         </w:rPr>
-        <w:t>v5_all_structural_pairs.csv</w:t>
+        <w:t>scripts/recompute_nelson_condition1.py — standalone Nelson Condition 1 printer</w:t>
       </w:r>
     </w:p>
     <w:p>
       <w:pPr>
-        <w:pStyle w:val="ListBullet"/>
-        <w:spacing w:after="60"/>
-        <w:ind w:left="504"/>
-        <w:jc w:val="left"/>
+        <w:spacing w:after="160" w:before="0" w:line="276" w:lineRule="auto"/>
+        <w:ind w:firstLine="0"/>
+        <w:jc w:val="both"/>
       </w:pPr>
       <w:r>
         <w:rPr>
@@ -9486,114 +9484,7 @@
           <w:color w:val="222222"/>
           <w:sz w:val="22"/>
         </w:rPr>
-        <w:t>v6_selected_channel_pairs.csv</w:t>
-      </w:r>
-    </w:p>
-    <w:p>
-      <w:pPr>
-        <w:pStyle w:val="ListBullet"/>
-        <w:spacing w:after="60"/>
-        <w:ind w:left="504"/>
-        <w:jc w:val="left"/>
-      </w:pPr>
-      <w:r>
-        <w:rPr>
-          <w:rFonts w:ascii="Times New Roman" w:hAnsi="Times New Roman" w:eastAsia="Times New Roman"/>
-          <w:b w:val="0"/>
-          <w:i w:val="0"/>
-          <w:color w:val="222222"/>
-          <w:sz w:val="22"/>
-        </w:rPr>
-        <w:t>v6_structural_checks.csv</w:t>
-      </w:r>
-    </w:p>
-    <w:p>
-      <w:pPr>
-        <w:pStyle w:val="ListBullet"/>
-        <w:spacing w:after="60"/>
-        <w:ind w:left="504"/>
-        <w:jc w:val="left"/>
-      </w:pPr>
-      <w:r>
-        <w:rPr>
-          <w:rFonts w:ascii="Times New Roman" w:hAnsi="Times New Roman" w:eastAsia="Times New Roman"/>
-          <w:b w:val="0"/>
-          <w:i w:val="0"/>
-          <w:color w:val="222222"/>
-          <w:sz w:val="22"/>
-        </w:rPr>
-        <w:t>v6_family_recovery.csv</w:t>
-      </w:r>
-    </w:p>
-    <w:p>
-      <w:pPr>
-        <w:pStyle w:val="ListBullet"/>
-        <w:spacing w:after="60"/>
-        <w:ind w:left="504"/>
-        <w:jc w:val="left"/>
-      </w:pPr>
-      <w:r>
-        <w:rPr>
-          <w:rFonts w:ascii="Times New Roman" w:hAnsi="Times New Roman" w:eastAsia="Times New Roman"/>
-          <w:b w:val="0"/>
-          <w:i w:val="0"/>
-          <w:color w:val="222222"/>
-          <w:sz w:val="22"/>
-        </w:rPr>
-        <w:t>v7_equivalence_summary.csv</w:t>
-      </w:r>
-    </w:p>
-    <w:p>
-      <w:pPr>
-        <w:pStyle w:val="ListBullet"/>
-        <w:spacing w:after="60"/>
-        <w:ind w:left="504"/>
-        <w:jc w:val="left"/>
-      </w:pPr>
-      <w:r>
-        <w:rPr>
-          <w:rFonts w:ascii="Times New Roman" w:hAnsi="Times New Roman" w:eastAsia="Times New Roman"/>
-          <w:b w:val="0"/>
-          <w:i w:val="0"/>
-          <w:color w:val="222222"/>
-          <w:sz w:val="22"/>
-        </w:rPr>
-        <w:t>v8_preregistration_protocol.json</w:t>
-      </w:r>
-    </w:p>
-    <w:p>
-      <w:pPr>
-        <w:pStyle w:val="ListBullet"/>
-        <w:spacing w:after="60"/>
-        <w:ind w:left="504"/>
-        <w:jc w:val="left"/>
-      </w:pPr>
-      <w:r>
-        <w:rPr>
-          <w:rFonts w:ascii="Times New Roman" w:hAnsi="Times New Roman" w:eastAsia="Times New Roman"/>
-          <w:b w:val="0"/>
-          <w:i w:val="0"/>
-          <w:color w:val="222222"/>
-          <w:sz w:val="22"/>
-        </w:rPr>
-        <w:t>state_checkpoint_v8.json</w:t>
-      </w:r>
-    </w:p>
-    <w:p>
-      <w:pPr>
-        <w:spacing w:after="160" w:before="0" w:line="276" w:lineRule="auto"/>
-        <w:ind w:firstLine="0"/>
-        <w:jc w:val="both"/>
-      </w:pPr>
-      <w:r>
-        <w:rPr>
-          <w:rFonts w:ascii="Times New Roman" w:hAnsi="Times New Roman" w:eastAsia="Times New Roman"/>
-          <w:b w:val="0"/>
-          <w:i w:val="0"/>
-          <w:color w:val="222222"/>
-          <w:sz w:val="22"/>
-        </w:rPr>
-        <w:t>These artifacts support the synthetic claims reported here. Independent reimplementation has not yet been completed and remains a required gate before a confirmatory human study.</w:t>
+        <w:t>Not currently available as versioned public artifacts: the v3–v8 result files (for example former working names such as v4_equivalence_stats.csv, v5_all_structural_pairs.csv, v6_selected_channel_pairs.csv, v6_family_recovery.csv, v7_equivalence_summary.csv) were not preserved in this repository. The v3–v8 numbers reported in the main text therefore rest on the narrative of this note alone and must be treated as UNVERIFIED pending a public re-run. Releasing that pipeline as executable code plus versioned outputs is a required gate before any confirmatory human study. Independent reimplementation of the shipped v1/Nelson checks is already possible via python scripts/reproduce.py.</w:t>
       </w:r>
     </w:p>
     <w:p>

</xml_diff>